<commit_message>
Add base64 DOCX artifacts and README; update coursework and review DOCX files
### Motivation
- Some hosting and PR views do not handle binary `.docx` files well, so text (base64) copies are included to ensure the documents can be reviewed and restored.
- Provide clear, cross-platform instructions to decode the base64 artifacts back into usable Word documents.
- Include updated binary `.docx` files in the repository so the latest coursework and review documents are available.

### Description
- Add `artifacts/README.md` with Windows PowerShell and Linux/macOS commands to restore `.docx` files from their `.b64` counterparts.
- Add `artifacts/coursework.docx.b64` and `artifacts/review.docx.b64` containing base64-encoded copies of the coursework and review documents.
- Include updated binary Word documents (`Курсовая_по_дисциплине_Программирование_и_разработка_Web_приложений1.docx` and `Рецензия (2).docx`) in the repo.

### Testing
- No automated tests were run for this change.
</commit_message>
<xml_diff>
--- a/Рецензия (2).docx
+++ b/Рецензия (2).docx
@@ -422,33 +422,7 @@
         </w:rPr>
       </w:pPr>
       <w:r>
-        <w:rPr>
-          <w:bCs/>
-          <w:sz w:val="26"/>
-          <w:szCs w:val="26"/>
-        </w:rPr>
-        <w:t>Наименование</w:t>
-      </w:r>
-      <w:r>
-        <w:rPr>
-          <w:sz w:val="26"/>
-          <w:szCs w:val="26"/>
-        </w:rPr>
-        <w:t xml:space="preserve"> темы «</w:t>
-      </w:r>
-      <w:r>
-        <w:rPr>
-          <w:sz w:val="26"/>
-          <w:szCs w:val="26"/>
-        </w:rPr>
-        <w:t>Разработка сервиса ETL для миграции данных между БД</w:t>
-      </w:r>
-      <w:r>
-        <w:rPr>
-          <w:sz w:val="26"/>
-          <w:szCs w:val="26"/>
-        </w:rPr>
-        <w:t>»</w:t>
+        <w:t>Наименование темы «Сервис сравнения цен товаров с парсингом магазинов (Scrapy + Django + Celery)»</w:t>
       </w:r>
     </w:p>
     <w:p>
@@ -1134,184 +1108,7 @@
         </w:rPr>
       </w:pPr>
       <w:r>
-        <w:rPr>
-          <w:sz w:val="28"/>
-          <w:szCs w:val="28"/>
-        </w:rPr>
-        <w:t>В рамках выполнения курсово</w:t>
-      </w:r>
-      <w:r>
-        <w:rPr>
-          <w:sz w:val="28"/>
-          <w:szCs w:val="28"/>
-        </w:rPr>
-        <w:t>й</w:t>
-      </w:r>
-      <w:r>
-        <w:rPr>
-          <w:sz w:val="28"/>
-          <w:szCs w:val="28"/>
-        </w:rPr>
-        <w:t xml:space="preserve"> </w:t>
-      </w:r>
-      <w:r>
-        <w:rPr>
-          <w:sz w:val="28"/>
-          <w:szCs w:val="28"/>
-        </w:rPr>
-        <w:t>работы</w:t>
-      </w:r>
-      <w:r>
-        <w:rPr>
-          <w:sz w:val="28"/>
-          <w:szCs w:val="28"/>
-        </w:rPr>
-        <w:t xml:space="preserve"> был </w:t>
-      </w:r>
-      <w:r>
-        <w:rPr>
-          <w:sz w:val="28"/>
-          <w:szCs w:val="28"/>
-        </w:rPr>
-        <w:t xml:space="preserve">спроектирован и разработан сервис </w:t>
-      </w:r>
-      <w:r>
-        <w:rPr>
-          <w:sz w:val="28"/>
-          <w:szCs w:val="28"/>
-          <w:lang w:val="en-US"/>
-        </w:rPr>
-        <w:t>ETL</w:t>
-      </w:r>
-      <w:r>
-        <w:rPr>
-          <w:sz w:val="28"/>
-          <w:szCs w:val="28"/>
-        </w:rPr>
-        <w:t xml:space="preserve"> для миграции данных между БД, включающий в себя клиентскую часть, то есть сайт и программную, которая взаимодействует с внутренней памятью браузера. Реализация сервиса выполнена </w:t>
-      </w:r>
-      <w:r>
-        <w:rPr>
-          <w:sz w:val="28"/>
-          <w:szCs w:val="28"/>
-        </w:rPr>
-        <w:t xml:space="preserve">с использованием </w:t>
-      </w:r>
-      <w:r>
-        <w:rPr>
-          <w:sz w:val="28"/>
-          <w:szCs w:val="28"/>
-          <w:lang w:val="en-US"/>
-        </w:rPr>
-        <w:t>html</w:t>
-      </w:r>
-      <w:r>
-        <w:rPr>
-          <w:sz w:val="28"/>
-          <w:szCs w:val="28"/>
-        </w:rPr>
-        <w:t xml:space="preserve">, </w:t>
-      </w:r>
-      <w:proofErr w:type="spellStart"/>
-      <w:r>
-        <w:rPr>
-          <w:sz w:val="28"/>
-          <w:szCs w:val="28"/>
-          <w:lang w:val="en-US"/>
-        </w:rPr>
-        <w:t>css</w:t>
-      </w:r>
-      <w:proofErr w:type="spellEnd"/>
-      <w:r>
-        <w:rPr>
-          <w:sz w:val="28"/>
-          <w:szCs w:val="28"/>
-        </w:rPr>
-        <w:t xml:space="preserve">, </w:t>
-      </w:r>
-      <w:proofErr w:type="spellStart"/>
-      <w:r>
-        <w:rPr>
-          <w:sz w:val="28"/>
-          <w:szCs w:val="28"/>
-          <w:lang w:val="en-US"/>
-        </w:rPr>
-        <w:t>js</w:t>
-      </w:r>
-      <w:proofErr w:type="spellEnd"/>
-      <w:r>
-        <w:rPr>
-          <w:sz w:val="28"/>
-          <w:szCs w:val="28"/>
-        </w:rPr>
-        <w:t xml:space="preserve">, </w:t>
-      </w:r>
-      <w:r>
-        <w:rPr>
-          <w:sz w:val="28"/>
-          <w:szCs w:val="28"/>
-        </w:rPr>
-        <w:t xml:space="preserve">а также расширения для </w:t>
-      </w:r>
-      <w:r>
-        <w:rPr>
-          <w:sz w:val="28"/>
-          <w:szCs w:val="28"/>
-          <w:lang w:val="en-US"/>
-        </w:rPr>
-        <w:t>vs</w:t>
-      </w:r>
-      <w:r>
-        <w:rPr>
-          <w:sz w:val="28"/>
-          <w:szCs w:val="28"/>
-        </w:rPr>
-        <w:t xml:space="preserve"> </w:t>
-      </w:r>
-      <w:r>
-        <w:rPr>
-          <w:sz w:val="28"/>
-          <w:szCs w:val="28"/>
-          <w:lang w:val="en-US"/>
-        </w:rPr>
-        <w:t>code</w:t>
-      </w:r>
-      <w:r>
-        <w:rPr>
-          <w:sz w:val="28"/>
-          <w:szCs w:val="28"/>
-        </w:rPr>
-        <w:t>: “</w:t>
-      </w:r>
-      <w:r>
-        <w:rPr>
-          <w:sz w:val="28"/>
-          <w:szCs w:val="28"/>
-          <w:lang w:val="en-US"/>
-        </w:rPr>
-        <w:t>Live</w:t>
-      </w:r>
-      <w:r>
-        <w:rPr>
-          <w:sz w:val="28"/>
-          <w:szCs w:val="28"/>
-        </w:rPr>
-        <w:t xml:space="preserve"> </w:t>
-      </w:r>
-      <w:r>
-        <w:rPr>
-          <w:sz w:val="28"/>
-          <w:szCs w:val="28"/>
-          <w:lang w:val="en-US"/>
-        </w:rPr>
-        <w:t>server</w:t>
-      </w:r>
-      <w:r>
-        <w:rPr>
-          <w:sz w:val="28"/>
-          <w:szCs w:val="28"/>
-        </w:rPr>
-        <w:t>”</w:t>
+        <w:t>В рамках выполнения курсовой работы был спроектирован и разработан сервис сравнения цен товаров с парсингом интернет-магазинов, включающий Django-приложение, Scrapy-спайдеры, фоновые задачи Celery, хранение истории цен, уведомления о скидках и API для построения графиков.</w:t>
       </w:r>
     </w:p>
     <w:p>

</xml_diff>